<commit_message>
Add primary role models (Thaddaeus Koroma, Floyd Mayweather) to mindmap
Introduces a dedicated Leitbilder section for the user's own named
role models and cross-links their specific traits into the relevant
per-area leitbild lists (Physis, Emotion & Mental, Beziehungen, Zeit,
B/K/M, Spiritualitaet), alongside the existing book/method suggestions.
</commit_message>
<xml_diff>
--- a/docs/lebensbereiche/lebensbereiche-mindmap.docx
+++ b/docs/lebensbereiche/lebensbereiche-mindmap.docx
@@ -633,6 +633,115 @@
     <w:p>
       <w:pPr>
         <w:pStyle w:val="Heading1"/>
+        <w:spacing w:after="200" w:before="400"/>
+      </w:pPr>
+      <w:r>
+        <w:rPr>
+          <w:b/>
+          <w:bCs/>
+          <w:color w:val="1A1A2E"/>
+        </w:rPr>
+        <w:t xml:space="preserve">Deine primären Leitbilder</w:t>
+      </w:r>
+    </w:p>
+    <w:p>
+      <w:pPr>
+        <w:spacing w:after="150"/>
+      </w:pPr>
+      <w:r>
+        <w:t xml:space="preserve">Neben den fachspezifischen Vorschlägen je Bereich (Bücher, Methoden) hast du zwei reale Personen benannt, die deine Zielidentität über mehrere Bereiche hinweg verkörpern. Sie sind die Referenz für die tägliche Dispenza-Praxis: dich emotional mit dem Gefühl verbinden, bereits so zu sein, bevor die äußere Realität es bestätigt.</w:t>
+      </w:r>
+    </w:p>
+    <w:p>
+      <w:pPr>
+        <w:pStyle w:val="Heading2"/>
+        <w:spacing w:after="150" w:before="300"/>
+      </w:pPr>
+      <w:r>
+        <w:rPr>
+          <w:b/>
+          <w:bCs/>
+          <w:color w:val="2E86AB"/>
+        </w:rPr>
+        <w:t xml:space="preserve">Thaddaeus Koroma</w:t>
+      </w:r>
+    </w:p>
+    <w:p>
+      <w:pPr>
+        <w:spacing w:after="150"/>
+      </w:pPr>
+      <w:r>
+        <w:t xml:space="preserve">Eine reflektierte Persönlichkeit, die fast immer weiß, was zu tun ist. Sehr gut im Verkauf und im Geschäftssinn. Liest Menschentypen exzellent. Gleichzeitig Familienmensch, der weiß, worauf es ankommt. Insgesamt jemand, der die meisten der 7 Lebensbereiche selbst bereits auf einem hohen Niveau lebt — deshalb stammt auch das Grundmodell dieses Dokuments aus seiner Coaching-Session.</w:t>
+      </w:r>
+    </w:p>
+    <w:p>
+      <w:pPr>
+        <w:pStyle w:val="ListParagraph"/>
+        <w:numPr>
+          <w:ilvl w:val="0"/>
+          <w:numId w:val="2"/>
+        </w:numPr>
+        <w:spacing w:after="80"/>
+      </w:pPr>
+      <w:r>
+        <w:t xml:space="preserve">Bereiche, in denen er dir als Vorbild dient: Zeit (strategische Klarheit), B/K/M (Verkauf &amp; Geschäftssinn), Beziehungen (Menschenkenntnis &amp; Familiensinn), Spiritualität (Reflektiertheit).</w:t>
+      </w:r>
+    </w:p>
+    <w:p>
+      <w:pPr>
+        <w:pStyle w:val="Heading2"/>
+        <w:spacing w:after="150" w:before="300"/>
+      </w:pPr>
+      <w:r>
+        <w:rPr>
+          <w:b/>
+          <w:bCs/>
+          <w:color w:val="2E86AB"/>
+        </w:rPr>
+        <w:t xml:space="preserve">Floyd Mayweather</w:t>
+      </w:r>
+    </w:p>
+    <w:p>
+      <w:pPr>
+        <w:spacing w:after="150"/>
+      </w:pPr>
+      <w:r>
+        <w:t xml:space="preserve">Tritt mit klarer Aura und Selbstsicherheit nach außen auf, ist im Inneren aber herzlich — die Fähigkeit, situativ zwischen Präsenz und Nähe zu wählen, statt beides zu vermischen. Ungeschlagene Karriere durch kompromisslose, tägliche Trainingsdisziplin. Hat sich selbst als Marke aufgebaut und wurde durch eigene Verhandlungsmacht zum bestbezahlten Sportler der Welt.</w:t>
+      </w:r>
+    </w:p>
+    <w:p>
+      <w:pPr>
+        <w:pStyle w:val="ListParagraph"/>
+        <w:numPr>
+          <w:ilvl w:val="0"/>
+          <w:numId w:val="2"/>
+        </w:numPr>
+        <w:spacing w:after="80"/>
+      </w:pPr>
+      <w:r>
+        <w:t xml:space="preserve">Bereiche, in denen er dir als Vorbild dient: Physis (Trainingsdisziplin), Emotion &amp; Mental (Aura außen, Wärme innen), B/K/M &amp; Finanzen (Unternehmer der eigenen Marke).</w:t>
+      </w:r>
+    </w:p>
+    <w:p>
+      <w:pPr>
+        <w:spacing w:after="150"/>
+      </w:pPr>
+      <w:r>
+        <w:rPr>
+          <w:i/>
+          <w:iCs/>
+        </w:rPr>
+        <w:t xml:space="preserve">Hinweis: Die fachspezifischen Vorschläge (Attia, Kiyosaki, Sinek etc.) bleiben als konkrete Lernquellen bestehen — Koroma und Mayweather sind die emotionale Zielidentität, mit der du dich täglich verbindest; die Bücher/Methoden liefern das Handwerkszeug dazu.</w:t>
+      </w:r>
+    </w:p>
+    <w:p>
+      <w:r>
+        <w:br w:type="page"/>
+      </w:r>
+    </w:p>
+    <w:p>
+      <w:pPr>
+        <w:pStyle w:val="Heading1"/>
         <w:spacing w:after="100" w:before="300"/>
       </w:pPr>
       <w:r>
@@ -713,6 +822,19 @@
           <w:color w:val="2E86AB"/>
         </w:rPr>
         <w:t xml:space="preserve">Leitbild-Vorschläge</w:t>
+      </w:r>
+    </w:p>
+    <w:p>
+      <w:pPr>
+        <w:pStyle w:val="ListParagraph"/>
+        <w:numPr>
+          <w:ilvl w:val="0"/>
+          <w:numId w:val="2"/>
+        </w:numPr>
+        <w:spacing w:after="80"/>
+      </w:pPr>
+      <w:r>
+        <w:t xml:space="preserve">Dein Vorbild Floyd Mayweather — "TBE": ungeschlagene Karriere durch kompromisslose, tägliche Trainingsdisziplin, nicht durch Talent allein. Das Bild, das du täglich im Training abrufst.</w:t>
       </w:r>
     </w:p>
     <w:p>
@@ -936,6 +1058,19 @@
         <w:spacing w:after="80"/>
       </w:pPr>
       <w:r>
+        <w:t xml:space="preserve">Dein Vorbild Floyd Mayweather — Aura nach außen (Selbstsicherheit, klare Präsenz), Wärme im Inneren: die Fähigkeit, situativ zu entscheiden, wann du Stärke zeigst und wann du Nähe zulässt, statt beides zu vermischen.</w:t>
+      </w:r>
+    </w:p>
+    <w:p>
+      <w:pPr>
+        <w:pStyle w:val="ListParagraph"/>
+        <w:numPr>
+          <w:ilvl w:val="0"/>
+          <w:numId w:val="2"/>
+        </w:numPr>
+        <w:spacing w:after="80"/>
+      </w:pPr>
+      <w:r>
         <w:t xml:space="preserve">Dr. Joe Dispenza — die übergreifende Methode für dieses ganze Mindmap-Projekt: sich täglich mit der Emotion und Frequenz der Zielidentität verbinden, um sie zu werden, bevor die äußere Realität es bestätigt.</w:t>
       </w:r>
     </w:p>
@@ -1108,6 +1243,19 @@
         <w:spacing w:after="80"/>
       </w:pPr>
       <w:r>
+        <w:t xml:space="preserve">Dein Vorbild Thaddaeus Koroma — liest Menschentypen exzellent und ist gleichzeitig Familienmensch: die Kombination aus Menschenkenntnis und echter Bindungsfähigkeit, die du dir hier abschaust.</w:t>
+      </w:r>
+    </w:p>
+    <w:p>
+      <w:pPr>
+        <w:pStyle w:val="ListParagraph"/>
+        <w:numPr>
+          <w:ilvl w:val="0"/>
+          <w:numId w:val="2"/>
+        </w:numPr>
+        <w:spacing w:after="80"/>
+      </w:pPr>
+      <w:r>
         <w:t xml:space="preserve">Keith Ferrazzi — "Never Eat Alone": Beziehungsaufbau als aktive, großzügige Praxis statt Zufallsprodukt.</w:t>
       </w:r>
     </w:p>
@@ -1280,6 +1428,19 @@
         <w:spacing w:after="80"/>
       </w:pPr>
       <w:r>
+        <w:t xml:space="preserve">Dein Vorbild Thaddaeus Koroma — wirkt reflektiert und weiß fast immer, was als Nächstes zu tun ist: diese strategische Klarheit statt Aktionismus ist hier das Ziel.</w:t>
+      </w:r>
+    </w:p>
+    <w:p>
+      <w:pPr>
+        <w:pStyle w:val="ListParagraph"/>
+        <w:numPr>
+          <w:ilvl w:val="0"/>
+          <w:numId w:val="2"/>
+        </w:numPr>
+        <w:spacing w:after="80"/>
+      </w:pPr>
+      <w:r>
         <w:t xml:space="preserve">Greg McKeown — Essentialism: "weniger, aber besser" statt To-Do-Listen-Aktionismus.</w:t>
       </w:r>
     </w:p>
@@ -1452,6 +1613,32 @@
         <w:spacing w:after="80"/>
       </w:pPr>
       <w:r>
+        <w:t xml:space="preserve">Dein Vorbild Thaddaeus Koroma — sehr gut im Verkauf und im Geschäftssinn: genau die Fähigkeit, die dein aktuelles Business zielführend machen soll.</w:t>
+      </w:r>
+    </w:p>
+    <w:p>
+      <w:pPr>
+        <w:pStyle w:val="ListParagraph"/>
+        <w:numPr>
+          <w:ilvl w:val="0"/>
+          <w:numId w:val="2"/>
+        </w:numPr>
+        <w:spacing w:after="80"/>
+      </w:pPr>
+      <w:r>
+        <w:t xml:space="preserve">Dein Vorbild Floyd Mayweather — hat sich selbst als Marke aufgebaut und seine eigene Verhandlungsmacht so genutzt, dass er zum bestbezahlten Sportler der Welt wurde: Unternehmer seiner selbst, nicht nur Ausführender.</w:t>
+      </w:r>
+    </w:p>
+    <w:p>
+      <w:pPr>
+        <w:pStyle w:val="ListParagraph"/>
+        <w:numPr>
+          <w:ilvl w:val="0"/>
+          <w:numId w:val="2"/>
+        </w:numPr>
+        <w:spacing w:after="80"/>
+      </w:pPr>
+      <w:r>
         <w:t xml:space="preserve">Simon Sinek — "Start with Why": die innere Mission als Fundament, bevor Strategie und Taktik folgen.</w:t>
       </w:r>
     </w:p>
@@ -1797,6 +1984,19 @@
           <w:color w:val="2E86AB"/>
         </w:rPr>
         <w:t xml:space="preserve">Leitbild-Vorschläge</w:t>
+      </w:r>
+    </w:p>
+    <w:p>
+      <w:pPr>
+        <w:pStyle w:val="ListParagraph"/>
+        <w:numPr>
+          <w:ilvl w:val="0"/>
+          <w:numId w:val="2"/>
+        </w:numPr>
+        <w:spacing w:after="80"/>
+      </w:pPr>
+      <w:r>
+        <w:t xml:space="preserve">Dein Vorbild Thaddaeus Koroma — eine sehr reflektierte Person, die genau weiß, was zu tun ist: diese Klarheit entsteht aus innerer Arbeit, nicht aus Zufall.</w:t>
       </w:r>
     </w:p>
     <w:p>

</xml_diff>